<commit_message>
fix(templates): the progress letter recipient block sits flush with the page
The recipient name, role, organisation and address paragraphs in
progress-note-letter-v1.docx carried a 216-twip left indent and a green
left paragraph border, so those lines rendered offset from every other
line of the letter — in the portal's true-to-page preview and in the
exported document alike. Both are removed; the subject's bottom rule and
all controls, text and run styling are unchanged. Template SHA re-pinned
in the map and its guard test.

Co-Authored-By: Claude Fable 5 <noreply@anthropic.com>
</commit_message>
<xml_diff>
--- a/backend/fca/templates/progress-note-letter-v1.docx
+++ b/backend/fca/templates/progress-note-letter-v1.docx
@@ -43,10 +43,6 @@
       <w:pPr>
         <w:pStyle w:val="OPAL–Body"/>
         <w:spacing w:before="0" w:after="40" w:line="240" w:lineRule="auto"/>
-        <w:ind w:left="216"/>
-        <w:pBdr>
-          <w:left w:val="single" w:sz="14" w:space="8" w:color="C5E1CC"/>
-        </w:pBdr>
       </w:pPr>
       <w:sdt>
         <w:sdtPr>
@@ -72,10 +68,6 @@
       <w:pPr>
         <w:pStyle w:val="OPAL–Body"/>
         <w:spacing w:before="0" w:after="40" w:line="240" w:lineRule="auto"/>
-        <w:ind w:left="216"/>
-        <w:pBdr>
-          <w:left w:val="single" w:sz="14" w:space="8" w:color="C5E1CC"/>
-        </w:pBdr>
       </w:pPr>
       <w:sdt>
         <w:sdtPr>
@@ -101,10 +93,6 @@
       <w:pPr>
         <w:pStyle w:val="OPAL–Body"/>
         <w:spacing w:before="0" w:after="40" w:line="240" w:lineRule="auto"/>
-        <w:ind w:left="216"/>
-        <w:pBdr>
-          <w:left w:val="single" w:sz="14" w:space="8" w:color="C5E1CC"/>
-        </w:pBdr>
       </w:pPr>
       <w:sdt>
         <w:sdtPr>
@@ -130,10 +118,6 @@
       <w:pPr>
         <w:pStyle w:val="OPAL–Body"/>
         <w:spacing w:before="0" w:after="80" w:line="240" w:lineRule="auto"/>
-        <w:ind w:left="216"/>
-        <w:pBdr>
-          <w:left w:val="single" w:sz="14" w:space="8" w:color="C5E1CC"/>
-        </w:pBdr>
       </w:pPr>
       <w:sdt>
         <w:sdtPr>

</xml_diff>